<commit_message>
Se añade estructura fase 2 y fase 3 incluyendo archivos individuales
</commit_message>
<xml_diff>
--- a/Fase 1/Evidencias Grupales/1.5_GuiaEstudiante_Fase 1_Definicion Proyecto APT (Español).docx
+++ b/Fase 1/Evidencias Grupales/1.5_GuiaEstudiante_Fase 1_Definicion Proyecto APT (Español).docx
@@ -5253,23 +5253,7 @@
                 <w:sz w:val="20"/>
                 <w:szCs w:val="20"/>
               </w:rPr>
-              <w:t xml:space="preserve"> y </w:t>
-            </w:r>
-            <w:proofErr w:type="spellStart"/>
-            <w:r>
-              <w:rPr>
-                <w:sz w:val="20"/>
-                <w:szCs w:val="20"/>
-              </w:rPr>
-              <w:t>frontend</w:t>
-            </w:r>
-            <w:proofErr w:type="spellEnd"/>
-            <w:r>
-              <w:rPr>
-                <w:sz w:val="20"/>
-                <w:szCs w:val="20"/>
-              </w:rPr>
-              <w:t xml:space="preserve"> de la plataforma web para nutricionistas</w:t>
+              <w:t xml:space="preserve"> y frontend de la plataforma web para nutricionistas</w:t>
             </w:r>
           </w:p>
           <w:p>
@@ -6277,23 +6261,7 @@
                 <w:sz w:val="18"/>
                 <w:szCs w:val="18"/>
               </w:rPr>
-              <w:t xml:space="preserve">Seguridad en contraseñas y </w:t>
-            </w:r>
-            <w:proofErr w:type="spellStart"/>
-            <w:r>
-              <w:rPr>
-                <w:sz w:val="18"/>
-                <w:szCs w:val="18"/>
-              </w:rPr>
-              <w:t>tokenización</w:t>
-            </w:r>
-            <w:proofErr w:type="spellEnd"/>
-            <w:r>
-              <w:rPr>
-                <w:sz w:val="18"/>
-                <w:szCs w:val="18"/>
-              </w:rPr>
-              <w:t xml:space="preserve"> en cada </w:t>
+              <w:t xml:space="preserve">Seguridad en contraseñas y tokenización en cada </w:t>
             </w:r>
             <w:proofErr w:type="spellStart"/>
             <w:r>
@@ -6478,23 +6446,7 @@
                 <w:sz w:val="18"/>
                 <w:szCs w:val="18"/>
               </w:rPr>
-              <w:t xml:space="preserve">Avances app nutricionista 1. elaboración de </w:t>
-            </w:r>
-            <w:proofErr w:type="spellStart"/>
-            <w:r>
-              <w:rPr>
-                <w:sz w:val="18"/>
-                <w:szCs w:val="18"/>
-              </w:rPr>
-              <w:t>frontend</w:t>
-            </w:r>
-            <w:proofErr w:type="spellEnd"/>
-            <w:r>
-              <w:rPr>
-                <w:sz w:val="18"/>
-                <w:szCs w:val="18"/>
-              </w:rPr>
-              <w:t xml:space="preserve"> y diseño.</w:t>
+              <w:t>Avances app nutricionista 1. elaboración de frontend y diseño.</w:t>
             </w:r>
           </w:p>
           <w:p>
@@ -6520,23 +6472,7 @@
                 <w:sz w:val="18"/>
                 <w:szCs w:val="18"/>
               </w:rPr>
-              <w:t>Prototipado de formularios de evaluación diferenciados y diagnósticos por nicho (</w:t>
-            </w:r>
-            <w:proofErr w:type="spellStart"/>
-            <w:r>
-              <w:rPr>
-                <w:sz w:val="18"/>
-                <w:szCs w:val="18"/>
-              </w:rPr>
-              <w:t>Figma</w:t>
-            </w:r>
-            <w:proofErr w:type="spellEnd"/>
-            <w:r>
-              <w:rPr>
-                <w:sz w:val="18"/>
-                <w:szCs w:val="18"/>
-              </w:rPr>
-              <w:t>)</w:t>
+              <w:t>Prototipado de formularios de evaluación diferenciados y diagnósticos por nicho (Figma)</w:t>
             </w:r>
           </w:p>
         </w:tc>
@@ -6564,25 +6500,7 @@
                 <w:sz w:val="18"/>
                 <w:szCs w:val="18"/>
               </w:rPr>
-              <w:t xml:space="preserve">Incorporación de medios de pago para consolidación de carácter de producto comercializable. El prototipado en </w:t>
-            </w:r>
-            <w:proofErr w:type="spellStart"/>
-            <w:r>
-              <w:rPr>
-                <w:color w:val="1F3864"/>
-                <w:sz w:val="18"/>
-                <w:szCs w:val="18"/>
-              </w:rPr>
-              <w:t>Figma</w:t>
-            </w:r>
-            <w:proofErr w:type="spellEnd"/>
-            <w:r>
-              <w:rPr>
-                <w:color w:val="1F3864"/>
-                <w:sz w:val="18"/>
-                <w:szCs w:val="18"/>
-              </w:rPr>
-              <w:t xml:space="preserve"> antecede a los formularios diferenciados por nicho, y la app del nutricionista puede comenzar apoyada en la API ya estabilizada.</w:t>
+              <w:t>Incorporación de medios de pago para consolidación de carácter de producto comercializable. El prototipado en Figma antecede a los formularios diferenciados por nicho, y la app del nutricionista puede comenzar apoyada en la API ya estabilizada.</w:t>
             </w:r>
           </w:p>
         </w:tc>
@@ -7355,6 +7273,7 @@
                 <w:bCs/>
                 <w:color w:val="1F3864"/>
               </w:rPr>
+              <w:lastRenderedPageBreak/>
               <w:t>Avance 9</w:t>
             </w:r>
           </w:p>
@@ -9809,6 +9728,7 @@
                 <w:sz w:val="20"/>
                 <w:szCs w:val="20"/>
               </w:rPr>
+              <w:lastRenderedPageBreak/>
               <w:t>Calidad y seguridad</w:t>
             </w:r>
           </w:p>
@@ -9851,23 +9771,7 @@
                 <w:sz w:val="18"/>
                 <w:szCs w:val="18"/>
               </w:rPr>
-              <w:t xml:space="preserve">Incorporación de cifrado y </w:t>
-            </w:r>
-            <w:proofErr w:type="spellStart"/>
-            <w:r>
-              <w:rPr>
-                <w:sz w:val="18"/>
-                <w:szCs w:val="18"/>
-              </w:rPr>
-              <w:t>tokenización</w:t>
-            </w:r>
-            <w:proofErr w:type="spellEnd"/>
-            <w:r>
-              <w:rPr>
-                <w:sz w:val="18"/>
-                <w:szCs w:val="18"/>
-              </w:rPr>
-              <w:t xml:space="preserve"> para el almacenamiento de credenciales y la protección de los </w:t>
+              <w:t xml:space="preserve">Incorporación de cifrado y tokenización para el almacenamiento de credenciales y la protección de los </w:t>
             </w:r>
             <w:proofErr w:type="spellStart"/>
             <w:r>
@@ -10263,17 +10167,8 @@
                 <w:sz w:val="18"/>
                 <w:szCs w:val="18"/>
               </w:rPr>
-              <w:t xml:space="preserve">, API REST, </w:t>
-            </w:r>
-            <w:proofErr w:type="spellStart"/>
-            <w:r>
-              <w:rPr>
-                <w:sz w:val="18"/>
-                <w:szCs w:val="18"/>
-              </w:rPr>
-              <w:t>Figma</w:t>
-            </w:r>
-            <w:proofErr w:type="spellEnd"/>
+              <w:t>, API REST, Figma</w:t>
+            </w:r>
           </w:p>
         </w:tc>
         <w:tc>
@@ -10464,23 +10359,7 @@
                 <w:sz w:val="18"/>
                 <w:szCs w:val="18"/>
               </w:rPr>
-              <w:t xml:space="preserve">Django, API REST, prototipos en </w:t>
-            </w:r>
-            <w:proofErr w:type="spellStart"/>
-            <w:r>
-              <w:rPr>
-                <w:sz w:val="18"/>
-                <w:szCs w:val="18"/>
-              </w:rPr>
-              <w:t>Figma</w:t>
-            </w:r>
-            <w:proofErr w:type="spellEnd"/>
-            <w:r>
-              <w:rPr>
-                <w:sz w:val="18"/>
-                <w:szCs w:val="18"/>
-              </w:rPr>
-              <w:t>.</w:t>
+              <w:t>Django, API REST, prototipos en Figma.</w:t>
             </w:r>
           </w:p>
         </w:tc>
@@ -11857,6 +11736,7 @@
                 <w:sz w:val="20"/>
                 <w:szCs w:val="20"/>
               </w:rPr>
+              <w:lastRenderedPageBreak/>
               <w:t>Calidad y seguridad</w:t>
             </w:r>
           </w:p>
@@ -15330,7 +15210,7 @@
                 <w:sz w:val="16"/>
                 <w:szCs w:val="16"/>
               </w:rPr>
-              <w:t>Integración de la pasarela de pago y prototipado de las nuevas funcionalidades del sistema.</w:t>
+              <w:t>Integración de la pasarela de pago y prototipado de las nuevas funcionalidades del sistema. Sistema de carpetas para exámenes médicos.</w:t>
             </w:r>
           </w:p>
         </w:tc>
@@ -15685,7 +15565,7 @@
                 <w:sz w:val="16"/>
                 <w:szCs w:val="16"/>
               </w:rPr>
-              <w:t>Incorporación de la lógica de negocio nutricional enfocada en patologías específicas y el nicho de mujeres embarazadas</w:t>
+              <w:t>Incorporación de la lógica de negocio nutricional enfocada en especialidad Nutrición deportiva. Implementación de APIs OCR en web. Formulario de Tendencia de Consumo.</w:t>
             </w:r>
           </w:p>
         </w:tc>
@@ -16040,7 +15920,16 @@
                 <w:sz w:val="16"/>
                 <w:szCs w:val="16"/>
               </w:rPr>
-              <w:t>Incorporación de la lógica de negocio nutricional enfocada en atención a niños y diabéticos. Sistema de carpetas para exámenes médicos</w:t>
+              <w:t>Incorporación de la lógica de negocio nutricional enfocada en</w:t>
+            </w:r>
+            <w:r>
+              <w:rPr>
+                <w:b/>
+                <w:bCs/>
+                <w:sz w:val="16"/>
+                <w:szCs w:val="16"/>
+              </w:rPr>
+              <w:t xml:space="preserve"> patología renal. Mejora del diseño actual en aplicación móvil.</w:t>
             </w:r>
           </w:p>
         </w:tc>

</xml_diff>

<commit_message>
Actualizacion de carta gantt
</commit_message>
<xml_diff>
--- a/Fase 1/Evidencias Grupales/1.5_GuiaEstudiante_Fase 1_Definicion Proyecto APT (Español).docx
+++ b/Fase 1/Evidencias Grupales/1.5_GuiaEstudiante_Fase 1_Definicion Proyecto APT (Español).docx
@@ -5149,7 +5149,23 @@
                 <w:sz w:val="20"/>
                 <w:szCs w:val="20"/>
               </w:rPr>
-              <w:t xml:space="preserve"> y frontend de la plataforma web para nutricionistas</w:t>
+              <w:t xml:space="preserve"> y </w:t>
+            </w:r>
+            <w:proofErr w:type="spellStart"/>
+            <w:r>
+              <w:rPr>
+                <w:sz w:val="20"/>
+                <w:szCs w:val="20"/>
+              </w:rPr>
+              <w:t>frontend</w:t>
+            </w:r>
+            <w:proofErr w:type="spellEnd"/>
+            <w:r>
+              <w:rPr>
+                <w:sz w:val="20"/>
+                <w:szCs w:val="20"/>
+              </w:rPr>
+              <w:t xml:space="preserve"> de la plataforma web para nutricionistas</w:t>
             </w:r>
           </w:p>
           <w:p>
@@ -10063,8 +10079,17 @@
                 <w:sz w:val="18"/>
                 <w:szCs w:val="18"/>
               </w:rPr>
-              <w:t>, API REST, Figma</w:t>
-            </w:r>
+              <w:t xml:space="preserve">, API REST, </w:t>
+            </w:r>
+            <w:proofErr w:type="spellStart"/>
+            <w:r>
+              <w:rPr>
+                <w:sz w:val="18"/>
+                <w:szCs w:val="18"/>
+              </w:rPr>
+              <w:t>Figma</w:t>
+            </w:r>
+            <w:proofErr w:type="spellEnd"/>
           </w:p>
         </w:tc>
         <w:tc>
@@ -12246,10 +12271,8 @@
     </w:p>
     <w:tbl>
       <w:tblPr>
-        <w:tblStyle w:val="af2"/>
-        <w:tblpPr w:leftFromText="180" w:rightFromText="180" w:topFromText="180" w:bottomFromText="180" w:vertAnchor="text" w:tblpX="-1205" w:tblpY="39"/>
+        <w:tblpPr w:leftFromText="180" w:rightFromText="180" w:topFromText="180" w:bottomFromText="180" w:vertAnchor="text" w:tblpX="-1220"/>
         <w:tblW w:w="11025" w:type="dxa"/>
-        <w:tblInd w:w="0" w:type="dxa"/>
         <w:tblBorders>
           <w:top w:val="single" w:sz="4" w:space="0" w:color="BFBFBF"/>
           <w:left w:val="single" w:sz="4" w:space="0" w:color="BFBFBF"/>
@@ -12271,8 +12294,8 @@
         <w:gridCol w:w="390"/>
         <w:gridCol w:w="330"/>
         <w:gridCol w:w="315"/>
-        <w:gridCol w:w="281"/>
-        <w:gridCol w:w="454"/>
+        <w:gridCol w:w="360"/>
+        <w:gridCol w:w="375"/>
         <w:gridCol w:w="420"/>
         <w:gridCol w:w="450"/>
         <w:gridCol w:w="480"/>
@@ -12640,7 +12663,7 @@
         </w:tc>
         <w:tc>
           <w:tcPr>
-            <w:tcW w:w="281" w:type="dxa"/>
+            <w:tcW w:w="360" w:type="dxa"/>
           </w:tcPr>
           <w:p>
             <w:pPr>
@@ -12666,7 +12689,7 @@
         </w:tc>
         <w:tc>
           <w:tcPr>
-            <w:tcW w:w="454" w:type="dxa"/>
+            <w:tcW w:w="375" w:type="dxa"/>
           </w:tcPr>
           <w:p>
             <w:pPr>
@@ -13084,24 +13107,24 @@
         </w:tc>
         <w:tc>
           <w:tcPr>
-            <w:tcW w:w="281" w:type="dxa"/>
-          </w:tcPr>
-          <w:p>
-            <w:pPr>
-              <w:spacing w:line="360" w:lineRule="auto"/>
-              <w:jc w:val="both"/>
-              <w:rPr>
-                <w:b/>
-                <w:bCs/>
-                <w:sz w:val="16"/>
-                <w:szCs w:val="16"/>
-              </w:rPr>
-            </w:pPr>
-          </w:p>
-        </w:tc>
-        <w:tc>
-          <w:tcPr>
-            <w:tcW w:w="454" w:type="dxa"/>
+            <w:tcW w:w="360" w:type="dxa"/>
+          </w:tcPr>
+          <w:p>
+            <w:pPr>
+              <w:spacing w:line="360" w:lineRule="auto"/>
+              <w:jc w:val="both"/>
+              <w:rPr>
+                <w:b/>
+                <w:bCs/>
+                <w:sz w:val="16"/>
+                <w:szCs w:val="16"/>
+              </w:rPr>
+            </w:pPr>
+          </w:p>
+        </w:tc>
+        <w:tc>
+          <w:tcPr>
+            <w:tcW w:w="375" w:type="dxa"/>
           </w:tcPr>
           <w:p>
             <w:pPr>
@@ -13439,24 +13462,24 @@
         </w:tc>
         <w:tc>
           <w:tcPr>
-            <w:tcW w:w="281" w:type="dxa"/>
-          </w:tcPr>
-          <w:p>
-            <w:pPr>
-              <w:spacing w:line="360" w:lineRule="auto"/>
-              <w:jc w:val="both"/>
-              <w:rPr>
-                <w:b/>
-                <w:bCs/>
-                <w:sz w:val="16"/>
-                <w:szCs w:val="16"/>
-              </w:rPr>
-            </w:pPr>
-          </w:p>
-        </w:tc>
-        <w:tc>
-          <w:tcPr>
-            <w:tcW w:w="454" w:type="dxa"/>
+            <w:tcW w:w="360" w:type="dxa"/>
+          </w:tcPr>
+          <w:p>
+            <w:pPr>
+              <w:spacing w:line="360" w:lineRule="auto"/>
+              <w:jc w:val="both"/>
+              <w:rPr>
+                <w:b/>
+                <w:bCs/>
+                <w:sz w:val="16"/>
+                <w:szCs w:val="16"/>
+              </w:rPr>
+            </w:pPr>
+          </w:p>
+        </w:tc>
+        <w:tc>
+          <w:tcPr>
+            <w:tcW w:w="375" w:type="dxa"/>
           </w:tcPr>
           <w:p>
             <w:pPr>
@@ -13794,24 +13817,24 @@
         </w:tc>
         <w:tc>
           <w:tcPr>
-            <w:tcW w:w="281" w:type="dxa"/>
-          </w:tcPr>
-          <w:p>
-            <w:pPr>
-              <w:spacing w:line="360" w:lineRule="auto"/>
-              <w:jc w:val="both"/>
-              <w:rPr>
-                <w:b/>
-                <w:bCs/>
-                <w:sz w:val="16"/>
-                <w:szCs w:val="16"/>
-              </w:rPr>
-            </w:pPr>
-          </w:p>
-        </w:tc>
-        <w:tc>
-          <w:tcPr>
-            <w:tcW w:w="454" w:type="dxa"/>
+            <w:tcW w:w="360" w:type="dxa"/>
+          </w:tcPr>
+          <w:p>
+            <w:pPr>
+              <w:spacing w:line="360" w:lineRule="auto"/>
+              <w:jc w:val="both"/>
+              <w:rPr>
+                <w:b/>
+                <w:bCs/>
+                <w:sz w:val="16"/>
+                <w:szCs w:val="16"/>
+              </w:rPr>
+            </w:pPr>
+          </w:p>
+        </w:tc>
+        <w:tc>
+          <w:tcPr>
+            <w:tcW w:w="375" w:type="dxa"/>
           </w:tcPr>
           <w:p>
             <w:pPr>
@@ -14149,24 +14172,24 @@
         </w:tc>
         <w:tc>
           <w:tcPr>
-            <w:tcW w:w="281" w:type="dxa"/>
-          </w:tcPr>
-          <w:p>
-            <w:pPr>
-              <w:spacing w:line="360" w:lineRule="auto"/>
-              <w:jc w:val="both"/>
-              <w:rPr>
-                <w:b/>
-                <w:bCs/>
-                <w:sz w:val="16"/>
-                <w:szCs w:val="16"/>
-              </w:rPr>
-            </w:pPr>
-          </w:p>
-        </w:tc>
-        <w:tc>
-          <w:tcPr>
-            <w:tcW w:w="454" w:type="dxa"/>
+            <w:tcW w:w="360" w:type="dxa"/>
+          </w:tcPr>
+          <w:p>
+            <w:pPr>
+              <w:spacing w:line="360" w:lineRule="auto"/>
+              <w:jc w:val="both"/>
+              <w:rPr>
+                <w:b/>
+                <w:bCs/>
+                <w:sz w:val="16"/>
+                <w:szCs w:val="16"/>
+              </w:rPr>
+            </w:pPr>
+          </w:p>
+        </w:tc>
+        <w:tc>
+          <w:tcPr>
+            <w:tcW w:w="375" w:type="dxa"/>
           </w:tcPr>
           <w:p>
             <w:pPr>
@@ -14513,24 +14536,24 @@
         </w:tc>
         <w:tc>
           <w:tcPr>
-            <w:tcW w:w="281" w:type="dxa"/>
-          </w:tcPr>
-          <w:p>
-            <w:pPr>
-              <w:spacing w:line="360" w:lineRule="auto"/>
-              <w:jc w:val="both"/>
-              <w:rPr>
-                <w:b/>
-                <w:bCs/>
-                <w:sz w:val="16"/>
-                <w:szCs w:val="16"/>
-              </w:rPr>
-            </w:pPr>
-          </w:p>
-        </w:tc>
-        <w:tc>
-          <w:tcPr>
-            <w:tcW w:w="454" w:type="dxa"/>
+            <w:tcW w:w="360" w:type="dxa"/>
+          </w:tcPr>
+          <w:p>
+            <w:pPr>
+              <w:spacing w:line="360" w:lineRule="auto"/>
+              <w:jc w:val="both"/>
+              <w:rPr>
+                <w:b/>
+                <w:bCs/>
+                <w:sz w:val="16"/>
+                <w:szCs w:val="16"/>
+              </w:rPr>
+            </w:pPr>
+          </w:p>
+        </w:tc>
+        <w:tc>
+          <w:tcPr>
+            <w:tcW w:w="375" w:type="dxa"/>
           </w:tcPr>
           <w:p>
             <w:pPr>
@@ -14908,24 +14931,24 @@
         </w:tc>
         <w:tc>
           <w:tcPr>
-            <w:tcW w:w="281" w:type="dxa"/>
-          </w:tcPr>
-          <w:p>
-            <w:pPr>
-              <w:spacing w:line="360" w:lineRule="auto"/>
-              <w:jc w:val="both"/>
-              <w:rPr>
-                <w:b/>
-                <w:bCs/>
-                <w:sz w:val="16"/>
-                <w:szCs w:val="16"/>
-              </w:rPr>
-            </w:pPr>
-          </w:p>
-        </w:tc>
-        <w:tc>
-          <w:tcPr>
-            <w:tcW w:w="454" w:type="dxa"/>
+            <w:tcW w:w="360" w:type="dxa"/>
+          </w:tcPr>
+          <w:p>
+            <w:pPr>
+              <w:spacing w:line="360" w:lineRule="auto"/>
+              <w:jc w:val="both"/>
+              <w:rPr>
+                <w:b/>
+                <w:bCs/>
+                <w:sz w:val="16"/>
+                <w:szCs w:val="16"/>
+              </w:rPr>
+            </w:pPr>
+          </w:p>
+        </w:tc>
+        <w:tc>
+          <w:tcPr>
+            <w:tcW w:w="375" w:type="dxa"/>
           </w:tcPr>
           <w:p>
             <w:pPr>
@@ -15263,24 +15286,24 @@
         </w:tc>
         <w:tc>
           <w:tcPr>
-            <w:tcW w:w="281" w:type="dxa"/>
-          </w:tcPr>
-          <w:p>
-            <w:pPr>
-              <w:spacing w:line="360" w:lineRule="auto"/>
-              <w:jc w:val="both"/>
-              <w:rPr>
-                <w:b/>
-                <w:bCs/>
-                <w:sz w:val="16"/>
-                <w:szCs w:val="16"/>
-              </w:rPr>
-            </w:pPr>
-          </w:p>
-        </w:tc>
-        <w:tc>
-          <w:tcPr>
-            <w:tcW w:w="454" w:type="dxa"/>
+            <w:tcW w:w="360" w:type="dxa"/>
+          </w:tcPr>
+          <w:p>
+            <w:pPr>
+              <w:spacing w:line="360" w:lineRule="auto"/>
+              <w:jc w:val="both"/>
+              <w:rPr>
+                <w:b/>
+                <w:bCs/>
+                <w:sz w:val="16"/>
+                <w:szCs w:val="16"/>
+              </w:rPr>
+            </w:pPr>
+          </w:p>
+        </w:tc>
+        <w:tc>
+          <w:tcPr>
+            <w:tcW w:w="375" w:type="dxa"/>
           </w:tcPr>
           <w:p>
             <w:pPr>
@@ -15461,7 +15484,45 @@
                 <w:sz w:val="16"/>
                 <w:szCs w:val="16"/>
               </w:rPr>
-              <w:t>Incorporación de la lógica de negocio nutricional enfocada en especialidad Nutrición deportiva. Implementación de APIs OCR en web. Formulario de Tendencia de Consumo.</w:t>
+              <w:t xml:space="preserve">Incorporación de la lógica de negocio nutricional enfocada en especialidad Nutrición deportiva. Implementación de </w:t>
+            </w:r>
+            <w:proofErr w:type="spellStart"/>
+            <w:r>
+              <w:rPr>
+                <w:b/>
+                <w:bCs/>
+                <w:sz w:val="16"/>
+                <w:szCs w:val="16"/>
+              </w:rPr>
+              <w:t>APIs</w:t>
+            </w:r>
+            <w:proofErr w:type="spellEnd"/>
+            <w:r>
+              <w:rPr>
+                <w:b/>
+                <w:bCs/>
+                <w:sz w:val="16"/>
+                <w:szCs w:val="16"/>
+              </w:rPr>
+              <w:t xml:space="preserve"> OCR en web. </w:t>
+            </w:r>
+            <w:r>
+              <w:rPr>
+                <w:b/>
+                <w:bCs/>
+                <w:sz w:val="14"/>
+                <w:szCs w:val="14"/>
+              </w:rPr>
+              <w:t>Formulario</w:t>
+            </w:r>
+            <w:r>
+              <w:rPr>
+                <w:b/>
+                <w:bCs/>
+                <w:sz w:val="16"/>
+                <w:szCs w:val="16"/>
+              </w:rPr>
+              <w:t xml:space="preserve"> de Tendencia de Consumo.</w:t>
             </w:r>
           </w:p>
         </w:tc>
@@ -15614,7 +15675,7 @@
         </w:tc>
         <w:tc>
           <w:tcPr>
-            <w:tcW w:w="281" w:type="dxa"/>
+            <w:tcW w:w="360" w:type="dxa"/>
             <w:tcBorders>
               <w:left w:val="single" w:sz="4" w:space="0" w:color="E06666"/>
               <w:bottom w:val="single" w:sz="4" w:space="0" w:color="E06666"/>
@@ -15635,7 +15696,7 @@
         </w:tc>
         <w:tc>
           <w:tcPr>
-            <w:tcW w:w="454" w:type="dxa"/>
+            <w:tcW w:w="375" w:type="dxa"/>
           </w:tcPr>
           <w:p>
             <w:pPr>
@@ -15816,7 +15877,7 @@
                 <w:sz w:val="16"/>
                 <w:szCs w:val="16"/>
               </w:rPr>
-              <w:t>Analizador de Calidad de Dieta.  Investigación de Pediatría.  Incorporación de Teoría Pediatría en el sistema. Primera investigación para integrar Telemedicina a través de chat en real time.</w:t>
+              <w:t>Analizador de Calidad de Dieta.  Investigación de Pediatría.  Incorporación de Teoría Pediatría en el sistema. Primera investigación para integrar Telemedicina a través de chat en real time.</w:t>
             </w:r>
           </w:p>
         </w:tc>
@@ -15962,7 +16023,7 @@
         </w:tc>
         <w:tc>
           <w:tcPr>
-            <w:tcW w:w="281" w:type="dxa"/>
+            <w:tcW w:w="360" w:type="dxa"/>
             <w:tcBorders>
               <w:top w:val="single" w:sz="4" w:space="0" w:color="E06666"/>
               <w:left w:val="single" w:sz="4" w:space="0" w:color="E06666"/>
@@ -15986,7 +16047,7 @@
         </w:tc>
         <w:tc>
           <w:tcPr>
-            <w:tcW w:w="454" w:type="dxa"/>
+            <w:tcW w:w="375" w:type="dxa"/>
             <w:tcBorders>
               <w:left w:val="single" w:sz="4" w:space="0" w:color="E06666"/>
               <w:bottom w:val="single" w:sz="4" w:space="0" w:color="E06666"/>
@@ -16171,7 +16232,7 @@
                 <w:sz w:val="16"/>
                 <w:szCs w:val="16"/>
               </w:rPr>
-              <w:t>Incorporación de la lógica de negocio nutricional enfocada en patología renal. Mejora del diseño actual en aplicación móvil. Desarrollo de Diagrama de Arquitectura. </w:t>
+              <w:t>Incorporación de la lógica de negocio nutricional enfocada en patología renal. Desarrollo de Diagrama de Arquitectura.  Mejora en ficha clínica: orden, añadir campos nuevos. Telemedicina implementación de Videollamada. Desarrollo de resúmenes de exámenes médicos con IA.</w:t>
             </w:r>
           </w:p>
         </w:tc>
@@ -16313,7 +16374,7 @@
         </w:tc>
         <w:tc>
           <w:tcPr>
-            <w:tcW w:w="281" w:type="dxa"/>
+            <w:tcW w:w="360" w:type="dxa"/>
             <w:tcBorders>
               <w:top w:val="single" w:sz="4" w:space="0" w:color="E06666"/>
               <w:right w:val="single" w:sz="4" w:space="0" w:color="E06666"/>
@@ -16334,7 +16395,7 @@
         </w:tc>
         <w:tc>
           <w:tcPr>
-            <w:tcW w:w="454" w:type="dxa"/>
+            <w:tcW w:w="375" w:type="dxa"/>
             <w:tcBorders>
               <w:top w:val="single" w:sz="4" w:space="0" w:color="E06666"/>
               <w:left w:val="single" w:sz="4" w:space="0" w:color="E06666"/>
@@ -16526,7 +16587,26 @@
                 <w:sz w:val="16"/>
                 <w:szCs w:val="16"/>
               </w:rPr>
-              <w:t>Mejora en ficha clínica: orden, añadir campos nuevos.</w:t>
+              <w:t xml:space="preserve">Desarrollo de resumen del paciente en cita previa como recordatorio de apoyo para el nutricionista (IA). Mejora del </w:t>
+            </w:r>
+            <w:r>
+              <w:rPr>
+                <w:b/>
+                <w:bCs/>
+                <w:sz w:val="16"/>
+                <w:szCs w:val="16"/>
+              </w:rPr>
+              <w:lastRenderedPageBreak/>
+              <w:t xml:space="preserve">diseño actual en aplicación móvil. Consolidación de telemedicina (videollamada). </w:t>
+            </w:r>
+            <w:r>
+              <w:rPr>
+                <w:b/>
+                <w:bCs/>
+                <w:sz w:val="16"/>
+                <w:szCs w:val="16"/>
+              </w:rPr>
+              <w:t>Planificación de Funcionalidades en APP de Nutricionista. Encuesta global subjetiva.</w:t>
             </w:r>
           </w:p>
         </w:tc>
@@ -16668,24 +16748,24 @@
         </w:tc>
         <w:tc>
           <w:tcPr>
-            <w:tcW w:w="281" w:type="dxa"/>
-          </w:tcPr>
-          <w:p>
-            <w:pPr>
-              <w:spacing w:line="360" w:lineRule="auto"/>
-              <w:jc w:val="both"/>
-              <w:rPr>
-                <w:b/>
-                <w:bCs/>
-                <w:sz w:val="16"/>
-                <w:szCs w:val="16"/>
-              </w:rPr>
-            </w:pPr>
-          </w:p>
-        </w:tc>
-        <w:tc>
-          <w:tcPr>
-            <w:tcW w:w="454" w:type="dxa"/>
+            <w:tcW w:w="360" w:type="dxa"/>
+          </w:tcPr>
+          <w:p>
+            <w:pPr>
+              <w:spacing w:line="360" w:lineRule="auto"/>
+              <w:jc w:val="both"/>
+              <w:rPr>
+                <w:b/>
+                <w:bCs/>
+                <w:sz w:val="16"/>
+                <w:szCs w:val="16"/>
+              </w:rPr>
+            </w:pPr>
+          </w:p>
+        </w:tc>
+        <w:tc>
+          <w:tcPr>
+            <w:tcW w:w="375" w:type="dxa"/>
             <w:tcBorders>
               <w:top w:val="single" w:sz="4" w:space="0" w:color="E06666"/>
               <w:right w:val="single" w:sz="4" w:space="0" w:color="E06666"/>
@@ -16881,8 +16961,36 @@
                 <w:sz w:val="16"/>
                 <w:szCs w:val="16"/>
               </w:rPr>
-              <w:lastRenderedPageBreak/>
-              <w:t>Desarrollo de la funcionalidad de resumen del paciente en cita previa como recordatorio de apoyo para el nutricionista y telemedicina</w:t>
+              <w:t xml:space="preserve">Desarrollo e implementación de la funcionalidad de validación y gestión del título profesional. </w:t>
+            </w:r>
+            <w:r>
+              <w:rPr>
+                <w:b/>
+                <w:bCs/>
+                <w:sz w:val="16"/>
+                <w:szCs w:val="16"/>
+              </w:rPr>
+              <w:t xml:space="preserve">Primera versión de la </w:t>
+            </w:r>
+            <w:proofErr w:type="gramStart"/>
+            <w:r>
+              <w:rPr>
+                <w:b/>
+                <w:bCs/>
+                <w:sz w:val="16"/>
+                <w:szCs w:val="16"/>
+              </w:rPr>
+              <w:t>app</w:t>
+            </w:r>
+            <w:proofErr w:type="gramEnd"/>
+            <w:r>
+              <w:rPr>
+                <w:b/>
+                <w:bCs/>
+                <w:sz w:val="16"/>
+                <w:szCs w:val="16"/>
+              </w:rPr>
+              <w:t xml:space="preserve"> nutricionista.</w:t>
             </w:r>
           </w:p>
         </w:tc>
@@ -17024,24 +17132,24 @@
         </w:tc>
         <w:tc>
           <w:tcPr>
-            <w:tcW w:w="281" w:type="dxa"/>
-          </w:tcPr>
-          <w:p>
-            <w:pPr>
-              <w:spacing w:line="360" w:lineRule="auto"/>
-              <w:jc w:val="both"/>
-              <w:rPr>
-                <w:b/>
-                <w:bCs/>
-                <w:sz w:val="16"/>
-                <w:szCs w:val="16"/>
-              </w:rPr>
-            </w:pPr>
-          </w:p>
-        </w:tc>
-        <w:tc>
-          <w:tcPr>
-            <w:tcW w:w="454" w:type="dxa"/>
+            <w:tcW w:w="360" w:type="dxa"/>
+          </w:tcPr>
+          <w:p>
+            <w:pPr>
+              <w:spacing w:line="360" w:lineRule="auto"/>
+              <w:jc w:val="both"/>
+              <w:rPr>
+                <w:b/>
+                <w:bCs/>
+                <w:sz w:val="16"/>
+                <w:szCs w:val="16"/>
+              </w:rPr>
+            </w:pPr>
+          </w:p>
+        </w:tc>
+        <w:tc>
+          <w:tcPr>
+            <w:tcW w:w="375" w:type="dxa"/>
           </w:tcPr>
           <w:p>
             <w:pPr>
@@ -17237,7 +17345,7 @@
                 <w:sz w:val="16"/>
                 <w:szCs w:val="16"/>
               </w:rPr>
-              <w:t xml:space="preserve">Desarrollo de la funcionalidad de resumen del paciente y sistema de citas previas con recordatorios de apoyo para el nutricionista </w:t>
+              <w:t>Entrega final del desarrollo completo de la aplicación del nutricionista.</w:t>
             </w:r>
           </w:p>
         </w:tc>
@@ -17379,24 +17487,24 @@
         </w:tc>
         <w:tc>
           <w:tcPr>
-            <w:tcW w:w="281" w:type="dxa"/>
-          </w:tcPr>
-          <w:p>
-            <w:pPr>
-              <w:spacing w:line="360" w:lineRule="auto"/>
-              <w:jc w:val="both"/>
-              <w:rPr>
-                <w:b/>
-                <w:bCs/>
-                <w:sz w:val="16"/>
-                <w:szCs w:val="16"/>
-              </w:rPr>
-            </w:pPr>
-          </w:p>
-        </w:tc>
-        <w:tc>
-          <w:tcPr>
-            <w:tcW w:w="454" w:type="dxa"/>
+            <w:tcW w:w="360" w:type="dxa"/>
+          </w:tcPr>
+          <w:p>
+            <w:pPr>
+              <w:spacing w:line="360" w:lineRule="auto"/>
+              <w:jc w:val="both"/>
+              <w:rPr>
+                <w:b/>
+                <w:bCs/>
+                <w:sz w:val="16"/>
+                <w:szCs w:val="16"/>
+              </w:rPr>
+            </w:pPr>
+          </w:p>
+        </w:tc>
+        <w:tc>
+          <w:tcPr>
+            <w:tcW w:w="375" w:type="dxa"/>
           </w:tcPr>
           <w:p>
             <w:pPr>
@@ -17592,7 +17700,7 @@
                 <w:sz w:val="16"/>
                 <w:szCs w:val="16"/>
               </w:rPr>
-              <w:t>Desarrollo e implementación de la funcionalidad de validación y gestión del título profesional</w:t>
+              <w:t>Desarrollo del sitio publicitario y manual de usuario.</w:t>
             </w:r>
           </w:p>
         </w:tc>
@@ -17734,24 +17842,24 @@
         </w:tc>
         <w:tc>
           <w:tcPr>
-            <w:tcW w:w="281" w:type="dxa"/>
-          </w:tcPr>
-          <w:p>
-            <w:pPr>
-              <w:spacing w:line="360" w:lineRule="auto"/>
-              <w:jc w:val="both"/>
-              <w:rPr>
-                <w:b/>
-                <w:bCs/>
-                <w:sz w:val="16"/>
-                <w:szCs w:val="16"/>
-              </w:rPr>
-            </w:pPr>
-          </w:p>
-        </w:tc>
-        <w:tc>
-          <w:tcPr>
-            <w:tcW w:w="454" w:type="dxa"/>
+            <w:tcW w:w="360" w:type="dxa"/>
+          </w:tcPr>
+          <w:p>
+            <w:pPr>
+              <w:spacing w:line="360" w:lineRule="auto"/>
+              <w:jc w:val="both"/>
+              <w:rPr>
+                <w:b/>
+                <w:bCs/>
+                <w:sz w:val="16"/>
+                <w:szCs w:val="16"/>
+              </w:rPr>
+            </w:pPr>
+          </w:p>
+        </w:tc>
+        <w:tc>
+          <w:tcPr>
+            <w:tcW w:w="375" w:type="dxa"/>
           </w:tcPr>
           <w:p>
             <w:pPr>
@@ -17947,7 +18055,7 @@
                 <w:sz w:val="16"/>
                 <w:szCs w:val="16"/>
               </w:rPr>
-              <w:t>Entrega final del desarrollo completo de la aplicación del paciente y sitio web publicitario</w:t>
+              <w:t>Plan de Pruebas (sistema completo) QA. Finalización de documentación técnica.</w:t>
             </w:r>
           </w:p>
         </w:tc>
@@ -18089,24 +18197,24 @@
         </w:tc>
         <w:tc>
           <w:tcPr>
-            <w:tcW w:w="281" w:type="dxa"/>
-          </w:tcPr>
-          <w:p>
-            <w:pPr>
-              <w:spacing w:line="360" w:lineRule="auto"/>
-              <w:jc w:val="both"/>
-              <w:rPr>
-                <w:b/>
-                <w:bCs/>
-                <w:sz w:val="16"/>
-                <w:szCs w:val="16"/>
-              </w:rPr>
-            </w:pPr>
-          </w:p>
-        </w:tc>
-        <w:tc>
-          <w:tcPr>
-            <w:tcW w:w="454" w:type="dxa"/>
+            <w:tcW w:w="360" w:type="dxa"/>
+          </w:tcPr>
+          <w:p>
+            <w:pPr>
+              <w:spacing w:line="360" w:lineRule="auto"/>
+              <w:jc w:val="both"/>
+              <w:rPr>
+                <w:b/>
+                <w:bCs/>
+                <w:sz w:val="16"/>
+                <w:szCs w:val="16"/>
+              </w:rPr>
+            </w:pPr>
+          </w:p>
+        </w:tc>
+        <w:tc>
+          <w:tcPr>
+            <w:tcW w:w="375" w:type="dxa"/>
           </w:tcPr>
           <w:p>
             <w:pPr>
@@ -18223,6 +18331,7 @@
             <w:gridSpan w:val="2"/>
             <w:tcBorders>
               <w:left w:val="single" w:sz="4" w:space="0" w:color="E06666"/>
+              <w:right w:val="single" w:sz="4" w:space="0" w:color="E06666"/>
             </w:tcBorders>
           </w:tcPr>
           <w:p>
@@ -18301,7 +18410,27 @@
                 <w:sz w:val="16"/>
                 <w:szCs w:val="16"/>
               </w:rPr>
-              <w:t>Ajustes finales, correcciones de detalles y entrega de evidencia necesaria del proyecto</w:t>
+              <w:t xml:space="preserve">Correcciones de acuerdo con el </w:t>
+            </w:r>
+            <w:proofErr w:type="spellStart"/>
+            <w:r>
+              <w:rPr>
+                <w:b/>
+                <w:bCs/>
+                <w:sz w:val="16"/>
+                <w:szCs w:val="16"/>
+              </w:rPr>
+              <w:t>Feedback</w:t>
+            </w:r>
+            <w:proofErr w:type="spellEnd"/>
+            <w:r>
+              <w:rPr>
+                <w:b/>
+                <w:bCs/>
+                <w:sz w:val="16"/>
+                <w:szCs w:val="16"/>
+              </w:rPr>
+              <w:t xml:space="preserve"> entregado por el Docente.</w:t>
             </w:r>
           </w:p>
         </w:tc>
@@ -18443,24 +18572,24 @@
         </w:tc>
         <w:tc>
           <w:tcPr>
-            <w:tcW w:w="281" w:type="dxa"/>
-          </w:tcPr>
-          <w:p>
-            <w:pPr>
-              <w:spacing w:line="360" w:lineRule="auto"/>
-              <w:jc w:val="both"/>
-              <w:rPr>
-                <w:b/>
-                <w:bCs/>
-                <w:sz w:val="16"/>
-                <w:szCs w:val="16"/>
-              </w:rPr>
-            </w:pPr>
-          </w:p>
-        </w:tc>
-        <w:tc>
-          <w:tcPr>
-            <w:tcW w:w="454" w:type="dxa"/>
+            <w:tcW w:w="360" w:type="dxa"/>
+          </w:tcPr>
+          <w:p>
+            <w:pPr>
+              <w:spacing w:line="360" w:lineRule="auto"/>
+              <w:jc w:val="both"/>
+              <w:rPr>
+                <w:b/>
+                <w:bCs/>
+                <w:sz w:val="16"/>
+                <w:szCs w:val="16"/>
+              </w:rPr>
+            </w:pPr>
+          </w:p>
+        </w:tc>
+        <w:tc>
+          <w:tcPr>
+            <w:tcW w:w="375" w:type="dxa"/>
           </w:tcPr>
           <w:p>
             <w:pPr>
@@ -18648,7 +18777,7 @@
                 <w:sz w:val="16"/>
                 <w:szCs w:val="16"/>
               </w:rPr>
-              <w:t>Presentación y demostración final del sistema ante la comisión evaluadora</w:t>
+              <w:t>Presentación y demostración final del sistema ante la comisión evaluadora.</w:t>
             </w:r>
           </w:p>
         </w:tc>
@@ -18790,24 +18919,24 @@
         </w:tc>
         <w:tc>
           <w:tcPr>
-            <w:tcW w:w="281" w:type="dxa"/>
-          </w:tcPr>
-          <w:p>
-            <w:pPr>
-              <w:spacing w:line="360" w:lineRule="auto"/>
-              <w:jc w:val="both"/>
-              <w:rPr>
-                <w:b/>
-                <w:bCs/>
-                <w:sz w:val="16"/>
-                <w:szCs w:val="16"/>
-              </w:rPr>
-            </w:pPr>
-          </w:p>
-        </w:tc>
-        <w:tc>
-          <w:tcPr>
-            <w:tcW w:w="454" w:type="dxa"/>
+            <w:tcW w:w="360" w:type="dxa"/>
+          </w:tcPr>
+          <w:p>
+            <w:pPr>
+              <w:spacing w:line="360" w:lineRule="auto"/>
+              <w:jc w:val="both"/>
+              <w:rPr>
+                <w:b/>
+                <w:bCs/>
+                <w:sz w:val="16"/>
+                <w:szCs w:val="16"/>
+              </w:rPr>
+            </w:pPr>
+          </w:p>
+        </w:tc>
+        <w:tc>
+          <w:tcPr>
+            <w:tcW w:w="375" w:type="dxa"/>
           </w:tcPr>
           <w:p>
             <w:pPr>
@@ -19141,24 +19270,24 @@
         </w:tc>
         <w:tc>
           <w:tcPr>
-            <w:tcW w:w="281" w:type="dxa"/>
-          </w:tcPr>
-          <w:p>
-            <w:pPr>
-              <w:spacing w:line="360" w:lineRule="auto"/>
-              <w:jc w:val="both"/>
-              <w:rPr>
-                <w:b/>
-                <w:bCs/>
-                <w:sz w:val="16"/>
-                <w:szCs w:val="16"/>
-              </w:rPr>
-            </w:pPr>
-          </w:p>
-        </w:tc>
-        <w:tc>
-          <w:tcPr>
-            <w:tcW w:w="454" w:type="dxa"/>
+            <w:tcW w:w="360" w:type="dxa"/>
+          </w:tcPr>
+          <w:p>
+            <w:pPr>
+              <w:spacing w:line="360" w:lineRule="auto"/>
+              <w:jc w:val="both"/>
+              <w:rPr>
+                <w:b/>
+                <w:bCs/>
+                <w:sz w:val="16"/>
+                <w:szCs w:val="16"/>
+              </w:rPr>
+            </w:pPr>
+          </w:p>
+        </w:tc>
+        <w:tc>
+          <w:tcPr>
+            <w:tcW w:w="375" w:type="dxa"/>
           </w:tcPr>
           <w:p>
             <w:pPr>
@@ -19501,12 +19630,43 @@
               <w:rPr>
                 <w:color w:val="1F3864"/>
               </w:rPr>
-              <w:t>Al mismo tiempo, esta fase nos hizo más conscientes de los riesgos que vienen, particularmente en torno a las funcionalidades de IA y al sprint de telemedicina, que concentran la mayor incertidumbre técnica de todo el plan. De cara al desarrollo, sentimos confianza en que la planificación que construimos es realista y está bien fundamentada, aunque también sabemos que serán necesarios ajustes sprint a sprint a medida que encontremos el tipo de dependencias no documentadas que suele esconder cualquier código heredado.</w:t>
+              <w:t xml:space="preserve">Al mismo tiempo, esta fase nos hizo más conscientes de los riesgos que vienen, particularmente en torno a las funcionalidades de IA y al sprint de telemedicina, que concentran la mayor incertidumbre técnica de todo el plan. De cara al desarrollo, sentimos confianza en que la planificación que construimos es realista </w:t>
+            </w:r>
+            <w:r>
+              <w:rPr>
+                <w:color w:val="1F3864"/>
+              </w:rPr>
+              <w:lastRenderedPageBreak/>
+              <w:t>y está bien fundamentada, aunque también sabemos que serán necesarios ajustes sprint a sprint a medida que encontremos el tipo de dependencias no documentadas que suele esconder cualquier código heredado.</w:t>
             </w:r>
           </w:p>
         </w:tc>
       </w:tr>
     </w:tbl>
+    <w:p>
+      <w:pPr>
+        <w:spacing w:after="0" w:line="360" w:lineRule="auto"/>
+        <w:jc w:val="both"/>
+        <w:rPr>
+          <w:b/>
+          <w:bCs/>
+          <w:sz w:val="24"/>
+          <w:szCs w:val="24"/>
+        </w:rPr>
+      </w:pPr>
+    </w:p>
+    <w:p>
+      <w:pPr>
+        <w:spacing w:after="0" w:line="360" w:lineRule="auto"/>
+        <w:jc w:val="both"/>
+        <w:rPr>
+          <w:b/>
+          <w:bCs/>
+          <w:sz w:val="24"/>
+          <w:szCs w:val="24"/>
+        </w:rPr>
+      </w:pPr>
+    </w:p>
     <w:p>
       <w:pPr>
         <w:spacing w:after="0" w:line="360" w:lineRule="auto"/>
@@ -21769,6 +21929,7 @@
   <w:style w:type="character" w:default="1" w:styleId="Fuentedeprrafopredeter">
     <w:name w:val="Default Paragraph Font"/>
     <w:uiPriority w:val="1"/>
+    <w:semiHidden/>
     <w:unhideWhenUsed/>
   </w:style>
   <w:style w:type="table" w:default="1" w:styleId="Tablanormal">

</xml_diff>